<commit_message>
Actualizacion de la documentacion final
</commit_message>
<xml_diff>
--- a/docs/FAT-Emprendimiento.docx
+++ b/docs/FAT-Emprendimiento.docx
@@ -329,7 +329,7 @@
         <mc:AlternateContent>
           <mc:Choice Requires="wps">
             <w:drawing>
-              <wp:anchor distT="0" distB="0" distL="114300" distR="114300" simplePos="0" relativeHeight="251660288" behindDoc="0" locked="0" layoutInCell="1" allowOverlap="1" wp14:anchorId="01E16BAA" wp14:editId="2B6161C0">
+              <wp:anchor distT="0" distB="0" distL="114300" distR="114300" simplePos="0" relativeHeight="251660288" behindDoc="0" locked="0" layoutInCell="1" allowOverlap="1" wp14:anchorId="01E16BAA" wp14:editId="3AF0EF10">
                 <wp:simplePos x="0" y="0"/>
                 <wp:positionH relativeFrom="column">
                   <wp:posOffset>3332184</wp:posOffset>
@@ -640,7 +640,7 @@
           <w:lang w:eastAsia="es-AR"/>
         </w:rPr>
         <w:drawing>
-          <wp:anchor distT="0" distB="0" distL="114300" distR="114300" simplePos="0" relativeHeight="251662336" behindDoc="1" locked="0" layoutInCell="1" allowOverlap="1" wp14:anchorId="4D577726" wp14:editId="1056F543">
+          <wp:anchor distT="0" distB="0" distL="114300" distR="114300" simplePos="0" relativeHeight="251662336" behindDoc="1" locked="0" layoutInCell="1" allowOverlap="1" wp14:anchorId="4D577726" wp14:editId="44C0FCD1">
             <wp:simplePos x="0" y="0"/>
             <wp:positionH relativeFrom="column">
               <wp:posOffset>962025</wp:posOffset>
@@ -946,20 +946,175 @@
       <w:r>
         <w:rPr>
           <w:rFonts w:ascii="Times New Roman" w:hAnsi="Times New Roman" w:cs="Times New Roman"/>
-          <w:sz w:val="24"/>
-          <w:szCs w:val="24"/>
-        </w:rPr>
-        <w:t>[Logo del proyecto/empresa]</w:t>
-      </w:r>
-    </w:p>
-    <w:p>
-      <w:pPr>
-        <w:rPr>
-          <w:rFonts w:ascii="Times New Roman" w:hAnsi="Times New Roman" w:cs="Times New Roman"/>
-          <w:sz w:val="24"/>
-          <w:szCs w:val="24"/>
-        </w:rPr>
-      </w:pPr>
+          <w:b/>
+          <w:bCs/>
+          <w:noProof/>
+          <w:sz w:val="24"/>
+          <w:szCs w:val="24"/>
+        </w:rPr>
+        <w:lastRenderedPageBreak/>
+        <w:drawing>
+          <wp:anchor distT="0" distB="0" distL="114300" distR="114300" simplePos="0" relativeHeight="251665408" behindDoc="1" locked="0" layoutInCell="1" allowOverlap="1" wp14:anchorId="29D9B3A9" wp14:editId="07D91E81">
+            <wp:simplePos x="0" y="0"/>
+            <wp:positionH relativeFrom="column">
+              <wp:posOffset>-30480</wp:posOffset>
+            </wp:positionH>
+            <wp:positionV relativeFrom="paragraph">
+              <wp:posOffset>305435</wp:posOffset>
+            </wp:positionV>
+            <wp:extent cx="5943600" cy="2567940"/>
+            <wp:effectExtent l="0" t="0" r="0" b="3810"/>
+            <wp:wrapTight wrapText="bothSides">
+              <wp:wrapPolygon edited="0">
+                <wp:start x="0" y="0"/>
+                <wp:lineTo x="0" y="21472"/>
+                <wp:lineTo x="21531" y="21472"/>
+                <wp:lineTo x="21531" y="0"/>
+                <wp:lineTo x="0" y="0"/>
+              </wp:wrapPolygon>
+            </wp:wrapTight>
+            <wp:docPr id="393100203" name="Imagen 1"/>
+            <wp:cNvGraphicFramePr>
+              <a:graphicFrameLocks xmlns:a="http://schemas.openxmlformats.org/drawingml/2006/main" noChangeAspect="1"/>
+            </wp:cNvGraphicFramePr>
+            <a:graphic xmlns:a="http://schemas.openxmlformats.org/drawingml/2006/main">
+              <a:graphicData uri="http://schemas.openxmlformats.org/drawingml/2006/picture">
+                <pic:pic xmlns:pic="http://schemas.openxmlformats.org/drawingml/2006/picture">
+                  <pic:nvPicPr>
+                    <pic:cNvPr id="0" name="Picture 1"/>
+                    <pic:cNvPicPr>
+                      <a:picLocks noChangeAspect="1" noChangeArrowheads="1"/>
+                    </pic:cNvPicPr>
+                  </pic:nvPicPr>
+                  <pic:blipFill>
+                    <a:blip r:embed="rId7">
+                      <a:extLst>
+                        <a:ext uri="{28A0092B-C50C-407E-A947-70E740481C1C}">
+                          <a14:useLocalDpi xmlns:a14="http://schemas.microsoft.com/office/drawing/2010/main" val="0"/>
+                        </a:ext>
+                      </a:extLst>
+                    </a:blip>
+                    <a:srcRect/>
+                    <a:stretch>
+                      <a:fillRect/>
+                    </a:stretch>
+                  </pic:blipFill>
+                  <pic:spPr bwMode="auto">
+                    <a:xfrm>
+                      <a:off x="0" y="0"/>
+                      <a:ext cx="5943600" cy="2567940"/>
+                    </a:xfrm>
+                    <a:prstGeom prst="rect">
+                      <a:avLst/>
+                    </a:prstGeom>
+                    <a:noFill/>
+                    <a:ln>
+                      <a:noFill/>
+                    </a:ln>
+                  </pic:spPr>
+                </pic:pic>
+              </a:graphicData>
+            </a:graphic>
+          </wp:anchor>
+        </w:drawing>
+      </w:r>
+      <w:r>
+        <w:rPr>
+          <w:rFonts w:ascii="Times New Roman" w:hAnsi="Times New Roman" w:cs="Times New Roman"/>
+          <w:sz w:val="24"/>
+          <w:szCs w:val="24"/>
+        </w:rPr>
+        <w:t>Logo Empresa</w:t>
+      </w:r>
+    </w:p>
+    <w:p>
+      <w:pPr>
+        <w:rPr>
+          <w:rFonts w:ascii="Times New Roman" w:hAnsi="Times New Roman" w:cs="Times New Roman"/>
+          <w:sz w:val="24"/>
+          <w:szCs w:val="24"/>
+        </w:rPr>
+      </w:pPr>
+      <w:r>
+        <w:rPr>
+          <w:rFonts w:ascii="Times New Roman" w:hAnsi="Times New Roman" w:cs="Times New Roman"/>
+          <w:noProof/>
+          <w:sz w:val="24"/>
+          <w:szCs w:val="24"/>
+        </w:rPr>
+        <w:drawing>
+          <wp:anchor distT="0" distB="0" distL="114300" distR="114300" simplePos="0" relativeHeight="251666432" behindDoc="1" locked="0" layoutInCell="1" allowOverlap="1" wp14:anchorId="309070D1" wp14:editId="129F3677">
+            <wp:simplePos x="0" y="0"/>
+            <wp:positionH relativeFrom="margin">
+              <wp:align>right</wp:align>
+            </wp:positionH>
+            <wp:positionV relativeFrom="paragraph">
+              <wp:posOffset>2917190</wp:posOffset>
+            </wp:positionV>
+            <wp:extent cx="5935980" cy="3901440"/>
+            <wp:effectExtent l="0" t="0" r="7620" b="3810"/>
+            <wp:wrapTight wrapText="bothSides">
+              <wp:wrapPolygon edited="0">
+                <wp:start x="0" y="0"/>
+                <wp:lineTo x="0" y="21516"/>
+                <wp:lineTo x="21558" y="21516"/>
+                <wp:lineTo x="21558" y="0"/>
+                <wp:lineTo x="0" y="0"/>
+              </wp:wrapPolygon>
+            </wp:wrapTight>
+            <wp:docPr id="1455656350" name="Imagen 2"/>
+            <wp:cNvGraphicFramePr>
+              <a:graphicFrameLocks xmlns:a="http://schemas.openxmlformats.org/drawingml/2006/main" noChangeAspect="1"/>
+            </wp:cNvGraphicFramePr>
+            <a:graphic xmlns:a="http://schemas.openxmlformats.org/drawingml/2006/main">
+              <a:graphicData uri="http://schemas.openxmlformats.org/drawingml/2006/picture">
+                <pic:pic xmlns:pic="http://schemas.openxmlformats.org/drawingml/2006/picture">
+                  <pic:nvPicPr>
+                    <pic:cNvPr id="0" name="Picture 2"/>
+                    <pic:cNvPicPr>
+                      <a:picLocks noChangeAspect="1" noChangeArrowheads="1"/>
+                    </pic:cNvPicPr>
+                  </pic:nvPicPr>
+                  <pic:blipFill>
+                    <a:blip r:embed="rId8">
+                      <a:extLst>
+                        <a:ext uri="{28A0092B-C50C-407E-A947-70E740481C1C}">
+                          <a14:useLocalDpi xmlns:a14="http://schemas.microsoft.com/office/drawing/2010/main" val="0"/>
+                        </a:ext>
+                      </a:extLst>
+                    </a:blip>
+                    <a:srcRect/>
+                    <a:stretch>
+                      <a:fillRect/>
+                    </a:stretch>
+                  </pic:blipFill>
+                  <pic:spPr bwMode="auto">
+                    <a:xfrm>
+                      <a:off x="0" y="0"/>
+                      <a:ext cx="5935980" cy="3901440"/>
+                    </a:xfrm>
+                    <a:prstGeom prst="rect">
+                      <a:avLst/>
+                    </a:prstGeom>
+                    <a:noFill/>
+                    <a:ln>
+                      <a:noFill/>
+                    </a:ln>
+                  </pic:spPr>
+                </pic:pic>
+              </a:graphicData>
+            </a:graphic>
+          </wp:anchor>
+        </w:drawing>
+      </w:r>
+      <w:r>
+        <w:rPr>
+          <w:rFonts w:ascii="Times New Roman" w:hAnsi="Times New Roman" w:cs="Times New Roman"/>
+          <w:sz w:val="24"/>
+          <w:szCs w:val="24"/>
+        </w:rPr>
+        <w:t>Logo proyecto</w:t>
+      </w:r>
     </w:p>
     <w:p>
       <w:pPr>
@@ -1004,16 +1159,82 @@
           <w:szCs w:val="24"/>
         </w:rPr>
       </w:pPr>
-    </w:p>
-    <w:p>
-      <w:pPr>
-        <w:ind w:firstLine="720"/>
-        <w:rPr>
-          <w:rFonts w:ascii="Times New Roman" w:hAnsi="Times New Roman" w:cs="Times New Roman"/>
-          <w:sz w:val="24"/>
-          <w:szCs w:val="24"/>
-        </w:rPr>
-      </w:pPr>
+      <w:proofErr w:type="spellStart"/>
+      <w:r>
+        <w:rPr>
+          <w:rFonts w:ascii="Times New Roman" w:hAnsi="Times New Roman" w:cs="Times New Roman"/>
+          <w:sz w:val="24"/>
+          <w:szCs w:val="24"/>
+        </w:rPr>
+        <w:t>Biovision</w:t>
+      </w:r>
+      <w:proofErr w:type="spellEnd"/>
+      <w:r>
+        <w:rPr>
+          <w:rFonts w:ascii="Times New Roman" w:hAnsi="Times New Roman" w:cs="Times New Roman"/>
+          <w:sz w:val="24"/>
+          <w:szCs w:val="24"/>
+        </w:rPr>
+        <w:t xml:space="preserve"> es una empresa la cual busca </w:t>
+      </w:r>
+      <w:r>
+        <w:rPr>
+          <w:rFonts w:ascii="Times New Roman" w:hAnsi="Times New Roman" w:cs="Times New Roman"/>
+          <w:sz w:val="24"/>
+          <w:szCs w:val="24"/>
+        </w:rPr>
+        <w:t xml:space="preserve">el cuidado de tu campo y plantas, utilizando a la IA como medio de </w:t>
+      </w:r>
+      <w:r>
+        <w:rPr>
+          <w:rFonts w:ascii="Times New Roman" w:hAnsi="Times New Roman" w:cs="Times New Roman"/>
+          <w:sz w:val="24"/>
+          <w:szCs w:val="24"/>
+        </w:rPr>
+        <w:t>identificación</w:t>
+      </w:r>
+      <w:r>
+        <w:rPr>
+          <w:rFonts w:ascii="Times New Roman" w:hAnsi="Times New Roman" w:cs="Times New Roman"/>
+          <w:sz w:val="24"/>
+          <w:szCs w:val="24"/>
+        </w:rPr>
+        <w:t xml:space="preserve"> de/los problemas</w:t>
+      </w:r>
+      <w:r>
+        <w:rPr>
+          <w:rFonts w:ascii="Times New Roman" w:hAnsi="Times New Roman" w:cs="Times New Roman"/>
+          <w:sz w:val="24"/>
+          <w:szCs w:val="24"/>
+        </w:rPr>
+        <w:t xml:space="preserve"> que se puedan presentar</w:t>
+      </w:r>
+    </w:p>
+    <w:p>
+      <w:pPr>
+        <w:ind w:firstLine="720"/>
+        <w:rPr>
+          <w:rFonts w:ascii="Times New Roman" w:hAnsi="Times New Roman" w:cs="Times New Roman"/>
+          <w:sz w:val="24"/>
+          <w:szCs w:val="24"/>
+        </w:rPr>
+      </w:pPr>
+      <w:r>
+        <w:rPr>
+          <w:rFonts w:ascii="Times New Roman" w:hAnsi="Times New Roman" w:cs="Times New Roman"/>
+          <w:sz w:val="24"/>
+          <w:szCs w:val="24"/>
+        </w:rPr>
+        <w:t>Nuestro proyecto se basa en una IA la cual usa una base de datos que permite identificar el/los problemas que pueden llegar a tener las plantas</w:t>
+      </w:r>
+      <w:r>
+        <w:rPr>
+          <w:rFonts w:ascii="Times New Roman" w:hAnsi="Times New Roman" w:cs="Times New Roman"/>
+          <w:sz w:val="24"/>
+          <w:szCs w:val="24"/>
+        </w:rPr>
+        <w:t>, una vez se haya identificado, te entrega una forma de cuidar a la planta</w:t>
+      </w:r>
     </w:p>
     <w:p>
       <w:pPr>
@@ -1267,7 +1488,6 @@
         <w:rPr>
           <w:rFonts w:ascii="Times New Roman" w:hAnsi="Times New Roman" w:cs="Times New Roman"/>
         </w:rPr>
-        <w:lastRenderedPageBreak/>
         <w:t xml:space="preserve">3) Etapa inicial: </w:t>
       </w:r>
       <w:proofErr w:type="spellStart"/>
@@ -1475,12 +1695,35 @@
           <w:rFonts w:ascii="Times New Roman" w:hAnsi="Times New Roman" w:cs="Times New Roman"/>
           <w:b/>
           <w:bCs/>
+          <w:sz w:val="24"/>
+          <w:szCs w:val="24"/>
+        </w:rPr>
+        <w:t>FODA DEL PROYECTO</w:t>
+      </w:r>
+    </w:p>
+    <w:p>
+      <w:pPr>
+        <w:ind w:firstLine="720"/>
+        <w:rPr>
+          <w:rFonts w:ascii="Times New Roman" w:hAnsi="Times New Roman" w:cs="Times New Roman"/>
+          <w:b/>
+          <w:bCs/>
+          <w:sz w:val="24"/>
+          <w:szCs w:val="24"/>
+        </w:rPr>
+      </w:pPr>
+      <w:r>
+        <w:rPr>
+          <w:rFonts w:ascii="Times New Roman" w:hAnsi="Times New Roman" w:cs="Times New Roman"/>
+          <w:b/>
+          <w:bCs/>
           <w:noProof/>
           <w:sz w:val="24"/>
           <w:szCs w:val="24"/>
         </w:rPr>
+        <w:lastRenderedPageBreak/>
         <w:drawing>
-          <wp:anchor distT="0" distB="0" distL="114300" distR="114300" simplePos="0" relativeHeight="251664384" behindDoc="1" locked="0" layoutInCell="1" allowOverlap="1" wp14:anchorId="365E6EC1" wp14:editId="7DC84E72">
+          <wp:anchor distT="0" distB="0" distL="114300" distR="114300" simplePos="0" relativeHeight="251664384" behindDoc="1" locked="0" layoutInCell="1" allowOverlap="1" wp14:anchorId="365E6EC1" wp14:editId="640D8209">
             <wp:simplePos x="0" y="0"/>
             <wp:positionH relativeFrom="margin">
               <wp:align>center</wp:align>
@@ -1513,7 +1756,7 @@
                     </pic:cNvPicPr>
                   </pic:nvPicPr>
                   <pic:blipFill>
-                    <a:blip r:embed="rId7">
+                    <a:blip r:embed="rId9">
                       <a:extLst>
                         <a:ext uri="{28A0092B-C50C-407E-A947-70E740481C1C}">
                           <a14:useLocalDpi xmlns:a14="http://schemas.microsoft.com/office/drawing/2010/main" val="0"/>
@@ -1572,19 +1815,103 @@
           <w:szCs w:val="24"/>
         </w:rPr>
       </w:pPr>
+    </w:p>
+    <w:p>
+      <w:pPr>
+        <w:ind w:firstLine="720"/>
+        <w:rPr>
+          <w:rFonts w:ascii="Times New Roman" w:hAnsi="Times New Roman" w:cs="Times New Roman"/>
+          <w:b/>
+          <w:bCs/>
+          <w:sz w:val="24"/>
+          <w:szCs w:val="24"/>
+        </w:rPr>
+      </w:pPr>
+    </w:p>
+    <w:p>
+      <w:pPr>
+        <w:ind w:firstLine="720"/>
+        <w:rPr>
+          <w:rFonts w:ascii="Times New Roman" w:hAnsi="Times New Roman" w:cs="Times New Roman"/>
+          <w:b/>
+          <w:bCs/>
+          <w:sz w:val="24"/>
+          <w:szCs w:val="24"/>
+        </w:rPr>
+      </w:pPr>
+    </w:p>
+    <w:p>
+      <w:pPr>
+        <w:ind w:firstLine="720"/>
+        <w:rPr>
+          <w:rFonts w:ascii="Times New Roman" w:hAnsi="Times New Roman" w:cs="Times New Roman"/>
+          <w:b/>
+          <w:bCs/>
+          <w:sz w:val="24"/>
+          <w:szCs w:val="24"/>
+        </w:rPr>
+      </w:pPr>
+    </w:p>
+    <w:p>
+      <w:pPr>
+        <w:ind w:firstLine="720"/>
+        <w:rPr>
+          <w:rFonts w:ascii="Times New Roman" w:hAnsi="Times New Roman" w:cs="Times New Roman"/>
+          <w:b/>
+          <w:bCs/>
+          <w:sz w:val="24"/>
+          <w:szCs w:val="24"/>
+        </w:rPr>
+      </w:pPr>
+    </w:p>
+    <w:p>
+      <w:pPr>
+        <w:ind w:firstLine="720"/>
+        <w:rPr>
+          <w:rFonts w:ascii="Times New Roman" w:hAnsi="Times New Roman" w:cs="Times New Roman"/>
+          <w:b/>
+          <w:bCs/>
+          <w:sz w:val="24"/>
+          <w:szCs w:val="24"/>
+        </w:rPr>
+      </w:pPr>
+    </w:p>
+    <w:p>
+      <w:pPr>
+        <w:ind w:firstLine="720"/>
+        <w:rPr>
+          <w:rFonts w:ascii="Times New Roman" w:hAnsi="Times New Roman" w:cs="Times New Roman"/>
+          <w:b/>
+          <w:bCs/>
+          <w:sz w:val="24"/>
+          <w:szCs w:val="24"/>
+        </w:rPr>
+      </w:pPr>
+    </w:p>
+    <w:p>
+      <w:pPr>
+        <w:ind w:firstLine="720"/>
+        <w:rPr>
+          <w:rFonts w:ascii="Times New Roman" w:hAnsi="Times New Roman" w:cs="Times New Roman"/>
+          <w:b/>
+          <w:bCs/>
+          <w:sz w:val="24"/>
+          <w:szCs w:val="24"/>
+        </w:rPr>
+      </w:pPr>
       <w:r>
         <w:rPr>
           <w:noProof/>
         </w:rPr>
         <w:lastRenderedPageBreak/>
         <w:drawing>
-          <wp:anchor distT="0" distB="0" distL="114300" distR="114300" simplePos="0" relativeHeight="251663360" behindDoc="1" locked="0" layoutInCell="1" allowOverlap="1" wp14:anchorId="3676C929" wp14:editId="4D849136">
+          <wp:anchor distT="0" distB="0" distL="114300" distR="114300" simplePos="0" relativeHeight="251663360" behindDoc="1" locked="0" layoutInCell="1" allowOverlap="1" wp14:anchorId="3676C929" wp14:editId="5B2CF196">
             <wp:simplePos x="0" y="0"/>
             <wp:positionH relativeFrom="margin">
-              <wp:posOffset>-731520</wp:posOffset>
+              <wp:align>center</wp:align>
             </wp:positionH>
             <wp:positionV relativeFrom="paragraph">
-              <wp:posOffset>220980</wp:posOffset>
+              <wp:posOffset>189865</wp:posOffset>
             </wp:positionV>
             <wp:extent cx="7437120" cy="5577840"/>
             <wp:effectExtent l="0" t="0" r="0" b="3810"/>
@@ -1611,7 +1938,7 @@
                     </pic:cNvPicPr>
                   </pic:nvPicPr>
                   <pic:blipFill>
-                    <a:blip r:embed="rId8">
+                    <a:blip r:embed="rId10">
                       <a:extLst>
                         <a:ext uri="{28A0092B-C50C-407E-A947-70E740481C1C}">
                           <a14:useLocalDpi xmlns:a14="http://schemas.microsoft.com/office/drawing/2010/main" val="0"/>
@@ -1680,18 +2007,6 @@
           <w:szCs w:val="24"/>
         </w:rPr>
       </w:pPr>
-    </w:p>
-    <w:p>
-      <w:pPr>
-        <w:ind w:firstLine="720"/>
-        <w:rPr>
-          <w:rFonts w:ascii="Times New Roman" w:hAnsi="Times New Roman" w:cs="Times New Roman"/>
-          <w:b/>
-          <w:bCs/>
-          <w:sz w:val="24"/>
-          <w:szCs w:val="24"/>
-        </w:rPr>
-      </w:pPr>
       <w:r>
         <w:rPr>
           <w:rFonts w:ascii="Times New Roman" w:hAnsi="Times New Roman" w:cs="Times New Roman"/>
@@ -1810,7 +2125,6 @@
           <w:sz w:val="24"/>
           <w:szCs w:val="24"/>
         </w:rPr>
-        <w:lastRenderedPageBreak/>
         <w:t xml:space="preserve">Nuestro medio de tecnología </w:t>
       </w:r>
       <w:r>
@@ -2298,7 +2612,6 @@
   <w:style w:type="character" w:default="1" w:styleId="Fuentedeprrafopredeter">
     <w:name w:val="Default Paragraph Font"/>
     <w:uiPriority w:val="1"/>
-    <w:semiHidden/>
     <w:unhideWhenUsed/>
   </w:style>
   <w:style w:type="table" w:default="1" w:styleId="Tablanormal">

</xml_diff>